<commit_message>
Reorder July 8 agenda: facility tour 9:00, presentation 9:30
Swap tour before presentation across guest guide, BOI hub, host tools,
slides, passport, QR sheet, tour map, and regenerated agenda docx.
</commit_message>
<xml_diff>
--- a/booklet/documents/suggested-agenda-therabreath.docx
+++ b/booklet/documents/suggested-agenda-therabreath.docx
@@ -49,7 +49,7 @@
         <w:t xml:space="preserve">9:00 AM — </w:t>
       </w:r>
       <w:r>
-        <w:t>Arrive — conference room across from The Flavor Factory</w:t>
+        <w:t>Arrive — 2058 Second Street, Norco · facility tour first</w:t>
       </w:r>
     </w:p>
     <w:p>
@@ -61,10 +61,10 @@
           <w:b/>
           <w:color w:val="008FD3"/>
         </w:rPr>
-        <w:t xml:space="preserve">9:00–10:00 — </w:t>
+        <w:t xml:space="preserve">9:00–9:25 — </w:t>
       </w:r>
       <w:r>
-        <w:t>Presentation — four pillars (resiliency, innovation, operations, partnership); Lakewood site parity; competitive &amp; functional innovation</w:t>
+        <w:t>Facility tour — production, QC, TheraBreath room</w:t>
       </w:r>
     </w:p>
     <w:p>
@@ -76,10 +76,10 @@
           <w:b/>
           <w:color w:val="008FD3"/>
         </w:rPr>
-        <w:t xml:space="preserve">10:00–10:15 — </w:t>
+        <w:t xml:space="preserve">9:30–10:15 — </w:t>
       </w:r>
       <w:r>
-        <w:t>Facility walkthrough — production, QC, TheraBreath room</w:t>
+        <w:t>Presentation — four pillars (resiliency, innovation, operations, partnership); Lakewood site parity; competitive &amp; functional innovation</w:t>
       </w:r>
     </w:p>
     <w:p>

</xml_diff>